<commit_message>
Entrega formal segun entregar §9 y §13: identificacion RTV Calibra, huellas MD5 en todos los manuales, hoja previa de campo y empaquetado de distribucion
</commit_message>
<xml_diff>
--- a/05_Documentacion/MANUAL-Interno-KnowHow-V3.6.docx
+++ b/05_Documentacion/MANUAL-Interno-KnowHow-V3.6.docx
@@ -208,6 +208,317 @@
         <w:t>).</w:t>
       </w:r>
     </w:p>
+    <w:p>
+      <w:pPr>
+        <w:pStyle w:val="Heading3"/>
+      </w:pPr>
+      <w:r>
+        <w:t>1.2 Binarios de Entrega Autorizados y Trazabilidad</w:t>
+      </w:r>
+    </w:p>
+    <w:tbl>
+      <w:tblPr>
+        <w:tblStyle w:val="TableGrid"/>
+        <w:tblW w:type="auto" w:w="0"/>
+        <w:jc w:val="center"/>
+        <w:tblLook w:firstColumn="1" w:firstRow="1" w:lastColumn="0" w:lastRow="0" w:noHBand="0" w:noVBand="1" w:val="04A0"/>
+      </w:tblPr>
+      <w:tblGrid>
+        <w:gridCol w:w="1728"/>
+        <w:gridCol w:w="1728"/>
+        <w:gridCol w:w="1728"/>
+        <w:gridCol w:w="1728"/>
+        <w:gridCol w:w="1728"/>
+      </w:tblGrid>
+      <w:tr>
+        <w:tc>
+          <w:tcPr>
+            <w:tcW w:type="dxa" w:w="1728"/>
+            <w:shd w:fill="D9D9D9"/>
+          </w:tcPr>
+          <w:p>
+            <w:r/>
+            <w:r>
+              <w:rPr>
+                <w:b/>
+              </w:rPr>
+              <w:t>Componente</w:t>
+            </w:r>
+          </w:p>
+        </w:tc>
+        <w:tc>
+          <w:tcPr>
+            <w:tcW w:type="dxa" w:w="1728"/>
+            <w:shd w:fill="D9D9D9"/>
+          </w:tcPr>
+          <w:p>
+            <w:r/>
+            <w:r>
+              <w:rPr>
+                <w:b/>
+              </w:rPr>
+              <w:t>Archivo binario</w:t>
+            </w:r>
+          </w:p>
+        </w:tc>
+        <w:tc>
+          <w:tcPr>
+            <w:tcW w:type="dxa" w:w="1728"/>
+            <w:shd w:fill="D9D9D9"/>
+          </w:tcPr>
+          <w:p>
+            <w:r/>
+            <w:r>
+              <w:rPr>
+                <w:b/>
+              </w:rPr>
+              <w:t>Versión / Código</w:t>
+            </w:r>
+          </w:p>
+        </w:tc>
+        <w:tc>
+          <w:tcPr>
+            <w:tcW w:type="dxa" w:w="1728"/>
+            <w:shd w:fill="D9D9D9"/>
+          </w:tcPr>
+          <w:p>
+            <w:r/>
+            <w:r>
+              <w:rPr>
+                <w:b/>
+              </w:rPr>
+              <w:t>Huella MD5</w:t>
+            </w:r>
+          </w:p>
+        </w:tc>
+        <w:tc>
+          <w:tcPr>
+            <w:tcW w:type="dxa" w:w="1728"/>
+            <w:shd w:fill="D9D9D9"/>
+          </w:tcPr>
+          <w:p>
+            <w:r/>
+            <w:r>
+              <w:rPr>
+                <w:b/>
+              </w:rPr>
+              <w:t>Audiencia / Manual</w:t>
+            </w:r>
+          </w:p>
+        </w:tc>
+      </w:tr>
+      <w:tr>
+        <w:tc>
+          <w:tcPr>
+            <w:tcW w:type="dxa" w:w="1728"/>
+          </w:tcPr>
+          <w:p>
+            <w:r/>
+            <w:r>
+              <w:rPr>
+                <w:b/>
+              </w:rPr>
+              <w:t>Firmware PIC</w:t>
+            </w:r>
+          </w:p>
+        </w:tc>
+        <w:tc>
+          <w:tcPr>
+            <w:tcW w:type="dxa" w:w="1728"/>
+          </w:tcPr>
+          <w:p>
+            <w:r/>
+            <w:r>
+              <w:rPr>
+                <w:rFonts w:ascii="Consolas" w:hAnsi="Consolas"/>
+                <w:color w:val="8B0000"/>
+                <w:sz w:val="18"/>
+              </w:rPr>
+              <w:t>RetroVertical_V3.6.hex</w:t>
+            </w:r>
+          </w:p>
+        </w:tc>
+        <w:tc>
+          <w:tcPr>
+            <w:tcW w:type="dxa" w:w="1728"/>
+          </w:tcPr>
+          <w:p>
+            <w:r/>
+            <w:r>
+              <w:t>V3.6.2 (XC8 v2.10)</w:t>
+            </w:r>
+          </w:p>
+        </w:tc>
+        <w:tc>
+          <w:tcPr>
+            <w:tcW w:type="dxa" w:w="1728"/>
+          </w:tcPr>
+          <w:p>
+            <w:r/>
+            <w:r>
+              <w:rPr>
+                <w:rFonts w:ascii="Consolas" w:hAnsi="Consolas"/>
+                <w:color w:val="8B0000"/>
+                <w:sz w:val="18"/>
+              </w:rPr>
+              <w:t>9d5d5e3951c8aa83d1465f16f3733d27</w:t>
+            </w:r>
+          </w:p>
+        </w:tc>
+        <w:tc>
+          <w:tcPr>
+            <w:tcW w:type="dxa" w:w="1728"/>
+          </w:tcPr>
+          <w:p>
+            <w:r/>
+            <w:r>
+              <w:t>Operación de Instrumento</w:t>
+            </w:r>
+          </w:p>
+        </w:tc>
+      </w:tr>
+      <w:tr>
+        <w:tc>
+          <w:tcPr>
+            <w:tcW w:type="dxa" w:w="1728"/>
+          </w:tcPr>
+          <w:p>
+            <w:r/>
+            <w:r>
+              <w:rPr>
+                <w:b/>
+              </w:rPr>
+              <w:t>App Cliente</w:t>
+            </w:r>
+          </w:p>
+        </w:tc>
+        <w:tc>
+          <w:tcPr>
+            <w:tcW w:type="dxa" w:w="1728"/>
+          </w:tcPr>
+          <w:p>
+            <w:r/>
+            <w:r>
+              <w:rPr>
+                <w:rFonts w:ascii="Consolas" w:hAnsi="Consolas"/>
+                <w:color w:val="8B0000"/>
+                <w:sz w:val="18"/>
+              </w:rPr>
+              <w:t>RETRO-COVIANDINA-usuario-0.3.7-10.apk</w:t>
+            </w:r>
+          </w:p>
+        </w:tc>
+        <w:tc>
+          <w:tcPr>
+            <w:tcW w:type="dxa" w:w="1728"/>
+          </w:tcPr>
+          <w:p>
+            <w:r/>
+            <w:r>
+              <w:t>0.3.7 (código 10)</w:t>
+            </w:r>
+          </w:p>
+        </w:tc>
+        <w:tc>
+          <w:tcPr>
+            <w:tcW w:type="dxa" w:w="1728"/>
+          </w:tcPr>
+          <w:p>
+            <w:r/>
+            <w:r>
+              <w:rPr>
+                <w:rFonts w:ascii="Consolas" w:hAnsi="Consolas"/>
+                <w:color w:val="8B0000"/>
+                <w:sz w:val="18"/>
+              </w:rPr>
+              <w:t>6aecf3ac2251db29f78b74d324b920cc</w:t>
+            </w:r>
+          </w:p>
+        </w:tc>
+        <w:tc>
+          <w:tcPr>
+            <w:tcW w:type="dxa" w:w="1728"/>
+          </w:tcPr>
+          <w:p>
+            <w:r/>
+            <w:r>
+              <w:t>Operador de Campo ("Retro Coviandina")</w:t>
+            </w:r>
+          </w:p>
+        </w:tc>
+      </w:tr>
+      <w:tr>
+        <w:tc>
+          <w:tcPr>
+            <w:tcW w:type="dxa" w:w="1728"/>
+          </w:tcPr>
+          <w:p>
+            <w:r/>
+            <w:r>
+              <w:rPr>
+                <w:b/>
+              </w:rPr>
+              <w:t>App Calibración</w:t>
+            </w:r>
+          </w:p>
+        </w:tc>
+        <w:tc>
+          <w:tcPr>
+            <w:tcW w:type="dxa" w:w="1728"/>
+          </w:tcPr>
+          <w:p>
+            <w:r/>
+            <w:r>
+              <w:rPr>
+                <w:rFonts w:ascii="Consolas" w:hAnsi="Consolas"/>
+                <w:color w:val="8B0000"/>
+                <w:sz w:val="18"/>
+              </w:rPr>
+              <w:t>Cov_3.6.5_calibrar.apk</w:t>
+            </w:r>
+          </w:p>
+        </w:tc>
+        <w:tc>
+          <w:tcPr>
+            <w:tcW w:type="dxa" w:w="1728"/>
+          </w:tcPr>
+          <w:p>
+            <w:r/>
+            <w:r>
+              <w:t>3.6.5 (código 10010)</w:t>
+            </w:r>
+          </w:p>
+        </w:tc>
+        <w:tc>
+          <w:tcPr>
+            <w:tcW w:type="dxa" w:w="1728"/>
+          </w:tcPr>
+          <w:p>
+            <w:r/>
+            <w:r>
+              <w:rPr>
+                <w:rFonts w:ascii="Consolas" w:hAnsi="Consolas"/>
+                <w:color w:val="8B0000"/>
+                <w:sz w:val="18"/>
+              </w:rPr>
+              <w:t>dc0beaf5e110a72b7cbb288e4011cb68</w:t>
+            </w:r>
+          </w:p>
+        </w:tc>
+        <w:tc>
+          <w:tcPr>
+            <w:tcW w:type="dxa" w:w="1728"/>
+          </w:tcPr>
+          <w:p>
+            <w:r/>
+            <w:r>
+              <w:t>Metrología y Laboratorio ("RTV Calibra")</w:t>
+            </w:r>
+          </w:p>
+        </w:tc>
+      </w:tr>
+    </w:tbl>
+    <w:p/>
     <w:p>
       <w:pPr>
         <w:spacing w:before="40" w:after="40"/>
@@ -1541,6 +1852,31 @@
         <w:rPr>
           <w:b/>
         </w:rPr>
+        <w:t>Etiqueta en pantalla:</w:t>
+      </w:r>
+      <w:r>
+        <w:t xml:space="preserve"> </w:t>
+      </w:r>
+      <w:r>
+        <w:rPr>
+          <w:rFonts w:ascii="Consolas" w:hAnsi="Consolas"/>
+          <w:color w:val="8B0000"/>
+          <w:sz w:val="18"/>
+        </w:rPr>
+        <w:t>RTV Calibra</w:t>
+      </w:r>
+      <w:r>
+        <w:t>.</w:t>
+      </w:r>
+    </w:p>
+    <w:p>
+      <w:pPr>
+        <w:pStyle w:val="ListBullet"/>
+      </w:pPr>
+      <w:r>
+        <w:rPr>
+          <w:b/>
+        </w:rPr>
         <w:t>Versión de campo validada:</w:t>
       </w:r>
       <w:r>
@@ -1555,7 +1891,7 @@
         <w:t>Cov_3.6.5_calibrar.apk</w:t>
       </w:r>
       <w:r>
-        <w:t xml:space="preserve"> (código 10010, commit </w:t>
+        <w:t xml:space="preserve"> (código 10010, MD5 </w:t>
       </w:r>
       <w:r>
         <w:rPr>
@@ -1563,7 +1899,7 @@
           <w:color w:val="8B0000"/>
           <w:sz w:val="18"/>
         </w:rPr>
-        <w:t>316a6bc</w:t>
+        <w:t>dc0beaf5e110a72b7cbb288e4011cb68</w:t>
       </w:r>
       <w:r>
         <w:t>).</w:t>

</xml_diff>

<commit_message>
Correcciones tecnicas en manual interno de know-how: UART STONE 9600 8N1, filtro ADC EMA 600, double 64 bits, retiro de PIN 2026 y aclaracion PA-13
</commit_message>
<xml_diff>
--- a/05_Documentacion/MANUAL-Interno-KnowHow-V3.6.docx
+++ b/05_Documentacion/MANUAL-Interno-KnowHow-V3.6.docx
@@ -117,7 +117,7 @@
         <w:jc w:val="both"/>
       </w:pPr>
       <w:r>
-        <w:t>microcontrolador a 115200 baudios (</w:t>
+        <w:t>microcontrolador configurada a 9600 baudios (8N1) en el binario grabado (</w:t>
       </w:r>
       <w:r>
         <w:rPr>
@@ -125,10 +125,10 @@
           <w:color w:val="8B0000"/>
           <w:sz w:val="18"/>
         </w:rPr>
-        <w:t>uart_stone.c:87-101</w:t>
+        <w:t>dist/default/production/RetroVertical_V3.6.X.production.lst:35500-35507</w:t>
       </w:r>
       <w:r>
-        <w:t>).</w:t>
+        <w:t>, BRG 416 con reloj de 16 MHz). La velocidad del módulo es configurable en su firmware y queda pendiente de validar contra el equipo físico.</w:t>
       </w:r>
     </w:p>
     <w:p>
@@ -186,7 +186,7 @@
         <w:t>measurement.c:208-250</w:t>
       </w:r>
       <w:r>
-        <w:t>), con</w:t>
+        <w:t>). El</w:t>
       </w:r>
     </w:p>
     <w:p>
@@ -194,7 +194,7 @@
         <w:jc w:val="both"/>
       </w:pPr>
       <w:r>
-        <w:t>promediado por hardware de 16 muestras más desplazamiento de 200 cuentas (</w:t>
+        <w:t>promedio suma los índices 1 a 15 (</w:t>
       </w:r>
       <w:r>
         <w:rPr>
@@ -202,7 +202,29 @@
           <w:color w:val="8B0000"/>
           <w:sz w:val="18"/>
         </w:rPr>
-        <w:t>measurement.c:212</w:t>
+        <w:t>measurement.c:234-237</w:t>
+      </w:r>
+      <w:r>
+        <w:t>) y el desplazamiento de +200 cuentas (</w:t>
+      </w:r>
+      <w:r>
+        <w:rPr>
+          <w:rFonts w:ascii="Consolas" w:hAnsi="Consolas"/>
+          <w:color w:val="8B0000"/>
+          <w:sz w:val="18"/>
+        </w:rPr>
+        <w:t>línea 247</w:t>
+      </w:r>
+      <w:r>
+        <w:t>) se aplica sobre un filtro EMA de software de 600 muestras (</w:t>
+      </w:r>
+      <w:r>
+        <w:rPr>
+          <w:rFonts w:ascii="Consolas" w:hAnsi="Consolas"/>
+          <w:color w:val="8B0000"/>
+          <w:sz w:val="18"/>
+        </w:rPr>
+        <w:t>líneas 239-245</w:t>
       </w:r>
       <w:r>
         <w:t>).</w:t>
@@ -1063,7 +1085,15 @@
         <w:pStyle w:val="ListBullet"/>
       </w:pPr>
       <w:r>
-        <w:t>Los códigos 1 y 2 son patrones base reservados de fábrica y no se sobreescriben durante calibraciones rutinarias.</w:t>
+        <w:t>Los códigos 1 y 2 corresponden a patrones base; la decisión de no sobreescribirlos corresponde a esta campaña</w:t>
+      </w:r>
+    </w:p>
+    <w:p>
+      <w:pPr>
+        <w:jc w:val="both"/>
+      </w:pPr>
+      <w:r>
+        <w:t>específica de calibración y no a una restricción física indeleble del firmware.</w:t>
       </w:r>
     </w:p>
     <w:p>
@@ -1079,7 +1109,18 @@
         <w:jc w:val="both"/>
       </w:pPr>
       <w:r>
-        <w:t>La evaluación se ejecuta en 32 bits de precisión sin esquema Horner para preservar estricta identidad numérica con la base de 2020 (</w:t>
+        <w:t xml:space="preserve">La evaluación se ejecuta en tipo </w:t>
+      </w:r>
+      <w:r>
+        <w:rPr>
+          <w:rFonts w:ascii="Consolas" w:hAnsi="Consolas"/>
+          <w:color w:val="8B0000"/>
+          <w:sz w:val="18"/>
+        </w:rPr>
+        <w:t>double</w:t>
+      </w:r>
+      <w:r>
+        <w:t xml:space="preserve"> (64 bits) sin esquema Horner para preservar estricta identidad numérica con la base de 2020 (</w:t>
       </w:r>
       <w:r>
         <w:rPr>
@@ -1395,7 +1436,7 @@
         <w:t>#L,&lt;pin&gt;#</w:t>
       </w:r>
       <w:r>
-        <w:t xml:space="preserve">: Autentica sesión de administración. El PIN de fábrica es </w:t>
+        <w:t>: Autentica sesión de administración (</w:t>
       </w:r>
       <w:r>
         <w:rPr>
@@ -1403,10 +1444,10 @@
           <w:color w:val="8B0000"/>
           <w:sz w:val="18"/>
         </w:rPr>
-        <w:t>2026</w:t>
+        <w:t>#L,&lt;pin&gt;#</w:t>
       </w:r>
       <w:r>
-        <w:t>. Al acumular 5 fallos consecutivos, el</w:t>
+        <w:t>; el PIN lo entrega DPI). Al acumular 5 fallos</w:t>
       </w:r>
     </w:p>
     <w:p>
@@ -1414,7 +1455,7 @@
         <w:jc w:val="both"/>
       </w:pPr>
       <w:r>
-        <w:t>firmware entra en estado de bloqueo permanente (</w:t>
+        <w:t>consecutivos, el firmware entra en estado de bloqueo permanente (</w:t>
       </w:r>
       <w:r>
         <w:rPr>
@@ -1441,7 +1482,15 @@
         <w:t>#P,&lt;pin_actual&gt;,&lt;pin_nuevo&gt;#</w:t>
       </w:r>
       <w:r>
-        <w:t xml:space="preserve">: Modifica el PIN de acceso. Conforme a </w:t>
+        <w:t>: Modifica el PIN de acceso. La exigencia de cambiar el PIN de fábrica queda en</w:t>
+      </w:r>
+    </w:p>
+    <w:p>
+      <w:pPr>
+        <w:jc w:val="both"/>
+      </w:pPr>
+      <w:r>
+        <w:t>suspenso hasta que se implemente el rol de superadministrador (</w:t>
       </w:r>
       <w:r>
         <w:rPr>
@@ -1449,18 +1498,10 @@
           <w:color w:val="8B0000"/>
           <w:sz w:val="18"/>
         </w:rPr>
-        <w:t>RF-CAL-29</w:t>
+        <w:t>SPEC-Calibracion-V3.6.md:911,1030</w:t>
       </w:r>
       <w:r>
-        <w:t>, es obligatorio cambiar el PIN</w:t>
-      </w:r>
-    </w:p>
-    <w:p>
-      <w:pPr>
-        <w:jc w:val="both"/>
-      </w:pPr>
-      <w:r>
-        <w:t>de fábrica antes de la primera calibración en campo.</w:t>
+        <w:t>, PA-13); hoy no existe un control activo en el firmware que impida operar con el PIN inicial si no se ha modificado.</w:t>
       </w:r>
     </w:p>
     <w:p>

</xml_diff>